<commit_message>
Atualiza CADNR e site: filtros, exclusoes, visualizacao e documentos
</commit_message>
<xml_diff>
--- a/projetta/nr 11 (40-munck) (Projetta).docx
+++ b/projetta/nr 11 (40-munck) (Projetta).docx
@@ -308,23 +308,7 @@
                 <w:sz w:val="26"/>
                 <w:szCs w:val="26"/>
               </w:rPr>
-              <w:t xml:space="preserve">as exigências da NR 11 da Portaria </w:t>
-            </w:r>
-            <w:proofErr w:type="spellStart"/>
-            <w:r>
-              <w:rPr>
-                <w:sz w:val="26"/>
-                <w:szCs w:val="26"/>
-              </w:rPr>
-              <w:t>MTb</w:t>
-            </w:r>
-            <w:proofErr w:type="spellEnd"/>
-            <w:r>
-              <w:rPr>
-                <w:sz w:val="26"/>
-                <w:szCs w:val="26"/>
-              </w:rPr>
-              <w:t xml:space="preserve"> nº 3.214/1978, e Lei nº 6.514/1977</w:t>
+              <w:t>as exigências da NR 11 da Portaria MTb nº 3.214/1978, e Lei nº 6.514/1977</w:t>
             </w:r>
             <w:r>
               <w:rPr>
@@ -354,7 +338,7 @@
                 <w:sz w:val="26"/>
                 <w:szCs w:val="26"/>
               </w:rPr>
-              <w:t>16</w:t>
+              <w:t>40</w:t>
             </w:r>
             <w:r>
               <w:rPr>
@@ -377,21 +361,7 @@
                 <w:sz w:val="26"/>
                 <w:szCs w:val="26"/>
               </w:rPr>
-              <w:t>s</w:t>
-            </w:r>
-            <w:r>
-              <w:rPr>
-                <w:sz w:val="26"/>
-                <w:szCs w:val="26"/>
-              </w:rPr>
-              <w:t xml:space="preserve"> dia</w:t>
-            </w:r>
-            <w:r>
-              <w:rPr>
-                <w:sz w:val="26"/>
-                <w:szCs w:val="26"/>
-              </w:rPr>
-              <w:t>s</w:t>
+              <w:t xml:space="preserve"> período de</w:t>
             </w:r>
             <w:r>
               <w:rPr>
@@ -416,7 +386,7 @@
                 <w:sz w:val="26"/>
                 <w:szCs w:val="26"/>
               </w:rPr>
-              <w:t>e</w:t>
+              <w:t>a</w:t>
             </w:r>
             <w:r>
               <w:rPr>
@@ -690,7 +660,7 @@
                       <w:noProof/>
                     </w:rPr>
                     <w:drawing>
-                      <wp:anchor distT="0" distB="0" distL="114300" distR="114300" simplePos="0" relativeHeight="251660288" behindDoc="1" locked="0" layoutInCell="1" allowOverlap="0" wp14:anchorId="1E0A145E" wp14:editId="2CAEFE2D">
+                      <wp:anchor distT="0" distB="0" distL="114300" distR="114300" simplePos="0" relativeHeight="251660288" behindDoc="1" locked="0" layoutInCell="1" allowOverlap="0" wp14:anchorId="1E0A145E" wp14:editId="13B62FC3">
                         <wp:simplePos x="0" y="0"/>
                         <wp:positionH relativeFrom="column">
                           <wp:posOffset>-180975</wp:posOffset>
@@ -1495,15 +1465,7 @@
               <w:spacing w:before="60" w:after="60" w:line="276" w:lineRule="auto"/>
             </w:pPr>
             <w:r>
-              <w:t xml:space="preserve">Checklist – inspeção diária do caminhão </w:t>
-            </w:r>
-            <w:proofErr w:type="spellStart"/>
-            <w:r>
-              <w:t>munck</w:t>
-            </w:r>
-            <w:proofErr w:type="spellEnd"/>
-            <w:r>
-              <w:t>/guindaste;</w:t>
+              <w:t>Checklist – inspeção diária do caminhão munck/guindaste;</w:t>
             </w:r>
           </w:p>
           <w:p>

</xml_diff>